<commit_message>
fix: update details of the planning
</commit_message>
<xml_diff>
--- a/docs/Sprint 2/Pilot_Testing/Feedback_Form.docx
+++ b/docs/Sprint 2/Pilot_Testing/Feedback_Form.docx
@@ -42,18 +42,12 @@
     </w:p>
     <w:p>
       <w:r>
-        <w:t>Name</w:t>
-      </w:r>
-      <w:r>
-        <w:t>: _______________________________</w:t>
+        <w:t>Name: _______________________________</w:t>
       </w:r>
     </w:p>
     <w:p>
       <w:r>
-        <w:t>Group</w:t>
-      </w:r>
-      <w:r>
-        <w:t xml:space="preserve">: </w:t>
+        <w:t xml:space="preserve">Group: </w:t>
       </w:r>
     </w:p>
     <w:p>
@@ -61,7 +55,7 @@
         <w:ind w:firstLine="720"/>
       </w:pPr>
       <w:r>
-        <w:t>☐ Group 1 (Technical)</w:t>
+        <w:t xml:space="preserve">☐ Group 1 </w:t>
       </w:r>
     </w:p>
     <w:p>
@@ -69,7 +63,7 @@
         <w:ind w:firstLine="720"/>
       </w:pPr>
       <w:r>
-        <w:t>☐ Group 2 (Non-Technical)</w:t>
+        <w:t xml:space="preserve">☐ Group 2 </w:t>
       </w:r>
     </w:p>
     <w:p>
@@ -83,24 +77,12 @@
         <w:t>☐</w:t>
       </w:r>
       <w:r>
-        <w:t xml:space="preserve"> </w:t>
-      </w:r>
-      <w:r>
-        <w:t xml:space="preserve">Casual Pilot User </w:t>
+        <w:t xml:space="preserve"> Casual Pilot User </w:t>
       </w:r>
     </w:p>
     <w:p>
       <w:r>
-        <w:t>Date</w:t>
-      </w:r>
-      <w:r>
-        <w:t xml:space="preserve">: ____________________    </w:t>
-      </w:r>
-      <w:r>
-        <w:t>Duration</w:t>
-      </w:r>
-      <w:r>
-        <w:t xml:space="preserve"> testing: ______ min</w:t>
+        <w:t>Date: ____________________    Duration testing: ______ min</w:t>
       </w:r>
     </w:p>
     <w:p>
@@ -1350,6 +1332,7 @@
   <w:style w:type="character" w:default="1" w:styleId="Fuentedeprrafopredeter">
     <w:name w:val="Default Paragraph Font"/>
     <w:uiPriority w:val="1"/>
+    <w:semiHidden/>
     <w:unhideWhenUsed/>
   </w:style>
   <w:style w:type="table" w:default="1" w:styleId="Tablanormal">

</xml_diff>